<commit_message>
Update GitHub owner to khaneilcampbell after account rename
Repo links, project.json files, the template and the hub guide now use the
new account name. car-01 notes that the profile README repository still
needs renaming to match the new username.

Co-Authored-By: Claude Opus 5.5 (1M context) <noreply@anthropic.com>
Claude-Session: https://claude.ai/code/session_01XfrqmboWhtSAoUzeLvJg68
</commit_message>
<xml_diff>
--- a/08 — Career Portfolio & Interview Preparation/car-01 GitHub Profile README/01 Project Overview.docx
+++ b/08 — Career Portfolio & Interview Preparation/car-01 GitHub Profile README/01 Project Overview.docx
@@ -331,7 +331,7 @@
                 <w:rPr>
                   <w:rStyle w:val="Hyperlink"/>
                 </w:rPr>
-                <w:t xml:space="preserve">khancam15/khancam15</w:t>
+                <w:t xml:space="preserve">khaneilcampbell/khancam15</w:t>
               </w:r>
             </w:hyperlink>
             <w:r>
@@ -344,7 +344,32 @@
               <w:rPr>
                 <w:sz w:val="18"/>
               </w:rPr>
-              <w:t xml:space="preserve">(public; shown on your profile page)</w:t>
+              <w:t xml:space="preserve">(public). [Verified 2026-10-26] Your account was renamed from khancam15 to khaneilcampbell, so this repository no longer matches your username. [Inferred from GitHub’s profile rule] It no longer shows on your profile. Rename it to</w:t>
+            </w:r>
+            <w:r>
+              <w:rPr>
+                <w:sz w:val="18"/>
+              </w:rPr>
+              <w:t xml:space="preserve"> </w:t>
+            </w:r>
+            <w:r>
+              <w:rPr>
+                <w:rStyle w:val="VerbatimChar"/>
+                <w:sz w:val="18"/>
+              </w:rPr>
+              <w:t xml:space="preserve">khaneilcampbell</w:t>
+            </w:r>
+            <w:r>
+              <w:rPr>
+                <w:sz w:val="18"/>
+              </w:rPr>
+              <w:t xml:space="preserve"> </w:t>
+            </w:r>
+            <w:r>
+              <w:rPr>
+                <w:sz w:val="18"/>
+              </w:rPr>
+              <w:t xml:space="preserve">to restore it</w:t>
             </w:r>
           </w:p>
         </w:tc>
@@ -567,7 +592,7 @@
         <w:t xml:space="preserve"> </w:t>
       </w:r>
       <w:r>
-        <w:t xml:space="preserve">[Verified] The README shown at the top of github.com/khancam15: your positioning (</w:t>
+        <w:t xml:space="preserve">[Verified] The README for the top of your GitHub profile page: your positioning (</w:t>
       </w:r>
       <w:r>
         <w:t xml:space="preserve">“</w:t>
@@ -777,7 +802,7 @@
         <w:t xml:space="preserve"> </w:t>
       </w:r>
       <w:r>
-        <w:t xml:space="preserve">in the special</w:t>
+        <w:t xml:space="preserve">in the</w:t>
       </w:r>
       <w:r>
         <w:t xml:space="preserve"> </w:t>
@@ -786,13 +811,28 @@
         <w:rPr>
           <w:rStyle w:val="VerbatimChar"/>
         </w:rPr>
-        <w:t xml:space="preserve">khancam15/khancam15</w:t>
-      </w:r>
-      <w:r>
-        <w:t xml:space="preserve"> </w:t>
-      </w:r>
-      <w:r>
-        <w:t xml:space="preserve">repository, which GitHub shows on your profile. 8 commits on</w:t>
+        <w:t xml:space="preserve">khaneilcampbell/khancam15</w:t>
+      </w:r>
+      <w:r>
+        <w:t xml:space="preserve"> </w:t>
+      </w:r>
+      <w:r>
+        <w:t xml:space="preserve">repository. GitHub shows a profile README only when the repository name equals your username, so it needs renaming to</w:t>
+      </w:r>
+      <w:r>
+        <w:t xml:space="preserve"> </w:t>
+      </w:r>
+      <w:r>
+        <w:rPr>
+          <w:rStyle w:val="VerbatimChar"/>
+        </w:rPr>
+        <w:t xml:space="preserve">khaneilcampbell</w:t>
+      </w:r>
+      <w:r>
+        <w:t xml:space="preserve"> </w:t>
+      </w:r>
+      <w:r>
+        <w:t xml:space="preserve">after the account rename. 8 commits on</w:t>
       </w:r>
       <w:r>
         <w:t xml:space="preserve"> </w:t>

</xml_diff>